<commit_message>
Update Inflation, Ouptut and the Phillips Curve.docx
</commit_message>
<xml_diff>
--- a/Clases Macroeconomía/Macroeconomía III - Teoría y Política Monetaria/Inflation, Ouptut and the Phillips Curve.docx
+++ b/Clases Macroeconomía/Macroeconomía III - Teoría y Política Monetaria/Inflation, Ouptut and the Phillips Curve.docx
@@ -5,6 +5,7 @@
     <w:p>
       <w:pPr>
         <w:pStyle w:val="Ttulo1"/>
+        <w:spacing w:before="0" w:after="160"/>
         <w:jc w:val="center"/>
         <w:rPr>
           <w:lang w:val="en-US"/>
@@ -17,6 +18,9 @@
         <w:t xml:space="preserve">Inflation, Output and the </w:t>
       </w:r>
       <w:r>
+        <w:rPr>
+          <w:lang w:val="en-US"/>
+        </w:rPr>
         <w:t>Phillips</w:t>
       </w:r>
       <w:r>
@@ -29,7 +33,11 @@
     <w:p>
       <w:pPr>
         <w:pStyle w:val="Ttulo4"/>
+        <w:spacing w:before="0" w:after="160"/>
         <w:jc w:val="both"/>
+        <w:rPr>
+          <w:lang w:val="en-US"/>
+        </w:rPr>
       </w:pPr>
       <w:r>
         <w:rPr>
@@ -513,14 +521,7 @@
           <w:rFonts w:eastAsiaTheme="minorEastAsia"/>
           <w:lang w:val="en-US"/>
         </w:rPr>
-        <w:t xml:space="preserve">Samuelson and Solow (1960) modified this to link price inflation </w:t>
-      </w:r>
-      <w:r>
-        <w:rPr>
-          <w:rFonts w:eastAsiaTheme="minorEastAsia"/>
-          <w:lang w:val="en-US"/>
-        </w:rPr>
-        <w:t>(</w:t>
+        <w:t>Samuelson and Solow (1960) modified this to link price inflation (</w:t>
       </w:r>
       <m:oMath>
         <m:sSub>
@@ -650,14 +651,7 @@
           <w:rFonts w:eastAsiaTheme="minorEastAsia"/>
           <w:lang w:val="en-US"/>
         </w:rPr>
-        <w:t xml:space="preserve"> </w:t>
-      </w:r>
-      <w:r>
-        <w:rPr>
-          <w:rFonts w:eastAsiaTheme="minorEastAsia"/>
-          <w:lang w:val="en-US"/>
-        </w:rPr>
-        <w:t xml:space="preserve">is labor productivity and </w:t>
+        <w:t xml:space="preserve"> is labor productivity and </w:t>
       </w:r>
       <m:oMath>
         <m:sSub>
@@ -695,14 +689,7 @@
           <w:rFonts w:eastAsiaTheme="minorEastAsia"/>
           <w:lang w:val="en-US"/>
         </w:rPr>
-        <w:t xml:space="preserve"> is the nominal wage</w:t>
-      </w:r>
-      <w:r>
-        <w:rPr>
-          <w:rFonts w:eastAsiaTheme="minorEastAsia"/>
-          <w:lang w:val="en-US"/>
-        </w:rPr>
-        <w:t>:</w:t>
+        <w:t xml:space="preserve"> is the nominal wage:</w:t>
       </w:r>
     </w:p>
     <w:p>
@@ -767,14 +754,7 @@
                   <w:rFonts w:ascii="Cambria Math" w:eastAsia="Times New Roman" w:hAnsi="Cambria Math" w:cs="Times New Roman"/>
                   <w:lang w:val="en-US" w:eastAsia="es-ES"/>
                 </w:rPr>
-                <m:t>1+</m:t>
-              </m:r>
-              <m:r>
-                <w:rPr>
-                  <w:rFonts w:ascii="Cambria Math" w:eastAsia="Times New Roman" w:hAnsi="Cambria Math" w:cs="Times New Roman"/>
-                  <w:lang w:val="en-US" w:eastAsia="es-ES"/>
-                </w:rPr>
-                <m:t>μ</m:t>
+                <m:t>1+μ</m:t>
               </m:r>
             </m:e>
           </m:d>
@@ -898,14 +878,7 @@
           <w:rFonts w:eastAsiaTheme="minorEastAsia"/>
           <w:lang w:val="en-US" w:eastAsia="es-ES"/>
         </w:rPr>
-        <w:t xml:space="preserve"> be the constant growth rate of labor productivity</w:t>
-      </w:r>
-      <w:r>
-        <w:rPr>
-          <w:rFonts w:eastAsiaTheme="minorEastAsia"/>
-          <w:lang w:val="en-US" w:eastAsia="es-ES"/>
-        </w:rPr>
-        <w:t>:</w:t>
+        <w:t xml:space="preserve"> be the constant growth rate of labor productivity:</w:t>
       </w:r>
     </w:p>
     <w:p>
@@ -1220,18 +1193,16 @@
         <w:rPr>
           <w:lang w:val="en-US"/>
         </w:rPr>
-        <w:t>Policymakers believed they could treat this equation as a menu of options, permanently choosing a lower unemployment rate at the cost of a permanently higher, but stable, inflation</w:t>
-      </w:r>
-      <w:r>
-        <w:rPr>
-          <w:lang w:val="en-US"/>
-        </w:rPr>
-        <w:t>.</w:t>
+        <w:t>Policymakers believed they could treat this equation as a menu of options, permanently choosing a lower unemployment rate at the cost of a permanently higher, but stable, inflation.</w:t>
       </w:r>
     </w:p>
     <w:p>
       <w:pPr>
         <w:pStyle w:val="Ttulo4"/>
+        <w:spacing w:before="0" w:after="160"/>
+        <w:rPr>
+          <w:lang w:val="en-US"/>
+        </w:rPr>
       </w:pPr>
       <w:r>
         <w:rPr>
@@ -1239,11 +1210,12 @@
         </w:rPr>
         <w:t xml:space="preserve">The Accelerationist </w:t>
       </w:r>
-      <w:proofErr w:type="spellStart"/>
-      <w:r>
+      <w:r>
+        <w:rPr>
+          <w:lang w:val="en-US"/>
+        </w:rPr>
         <w:t>Challenge</w:t>
       </w:r>
-      <w:proofErr w:type="spellEnd"/>
       <w:r>
         <w:rPr>
           <w:lang w:val="en-US"/>
@@ -1282,13 +1254,7 @@
         <w:rPr>
           <w:lang w:val="en-US"/>
         </w:rPr>
-        <w:t>, not the nominal wage. Thus, wage negotiations will incorporate expected inflation</w:t>
-      </w:r>
-      <w:r>
-        <w:rPr>
-          <w:lang w:val="en-US"/>
-        </w:rPr>
-        <w:t xml:space="preserve"> </w:t>
+        <w:t xml:space="preserve">, not the nominal wage. Thus, wage negotiations will incorporate expected inflation </w:t>
       </w:r>
       <m:oMath>
         <m:d>
@@ -1356,13 +1322,7 @@
         <w:rPr>
           <w:lang w:val="en-US"/>
         </w:rPr>
-        <w:t>The wage adjustment equation is modified to include expectations</w:t>
-      </w:r>
-      <w:r>
-        <w:rPr>
-          <w:lang w:val="en-US"/>
-        </w:rPr>
-        <w:t>:</w:t>
+        <w:t>The wage adjustment equation is modified to include expectations:</w:t>
       </w:r>
     </w:p>
     <w:p>
@@ -1514,13 +1474,7 @@
         <w:rPr>
           <w:lang w:val="en-US"/>
         </w:rPr>
-        <w:t>Assuming a linear specification for the function</w:t>
-      </w:r>
-      <w:r>
-        <w:rPr>
-          <w:lang w:val="en-US"/>
-        </w:rPr>
-        <w:t xml:space="preserve"> </w:t>
+        <w:t xml:space="preserve">Assuming a linear specification for the function </w:t>
       </w:r>
       <m:oMath>
         <m:r>
@@ -1714,13 +1668,7 @@
         <w:rPr>
           <w:lang w:val="en-US"/>
         </w:rPr>
-        <w:t>represents the Natural Rate of Unemployment (determined purely by real structural/frictional factors in the economy)</w:t>
-      </w:r>
-      <w:r>
-        <w:rPr>
-          <w:lang w:val="en-US"/>
-        </w:rPr>
-        <w:t>.</w:t>
+        <w:t>represents the Natural Rate of Unemployment (determined purely by real structural/frictional factors in the economy).</w:t>
       </w:r>
     </w:p>
     <w:p>
@@ -1767,14 +1715,7 @@
               <w:rFonts w:ascii="Cambria Math" w:eastAsia="Times New Roman" w:hAnsi="Cambria Math" w:cs="Times New Roman"/>
               <w:lang w:eastAsia="es-ES"/>
             </w:rPr>
-            <m:t>=-</m:t>
-          </m:r>
-          <m:r>
-            <w:rPr>
-              <w:rFonts w:ascii="Cambria Math" w:eastAsia="Times New Roman" w:hAnsi="Cambria Math" w:cs="Times New Roman"/>
-              <w:lang w:eastAsia="es-ES"/>
-            </w:rPr>
-            <m:t>β</m:t>
+            <m:t>=-β</m:t>
           </m:r>
           <m:d>
             <m:dPr>
@@ -1916,25 +1857,7 @@
         <w:rPr>
           <w:lang w:val="en-US"/>
         </w:rPr>
-        <w:t>Substituting this back into the price markup equation</w:t>
-      </w:r>
-      <w:r>
-        <w:rPr>
-          <w:lang w:val="en-US"/>
-        </w:rPr>
-        <w:t xml:space="preserve"> </w:t>
-      </w:r>
-      <w:r>
-        <w:rPr>
-          <w:lang w:val="en-US"/>
-        </w:rPr>
-        <w:t>and assuming productivity growth is absorbed into the definition</w:t>
-      </w:r>
-      <w:r>
-        <w:rPr>
-          <w:lang w:val="en-US"/>
-        </w:rPr>
-        <w:t xml:space="preserve"> of </w:t>
+        <w:t xml:space="preserve">Substituting this back into the price markup equation and assuming productivity growth is absorbed into the definition of </w:t>
       </w:r>
       <m:oMath>
         <m:sSup>
@@ -1978,13 +1901,7 @@
         <w:rPr>
           <w:lang w:val="en-US"/>
         </w:rPr>
-        <w:t>we arrive at the foundational augmented curve</w:t>
-      </w:r>
-      <w:r>
-        <w:rPr>
-          <w:lang w:val="en-US"/>
-        </w:rPr>
-        <w:t>.</w:t>
+        <w:t>we arrive at the foundational augmented curve.</w:t>
       </w:r>
     </w:p>
     <w:p>
@@ -2213,6 +2130,7 @@
     <w:p>
       <w:pPr>
         <w:pStyle w:val="Ttulo4"/>
+        <w:spacing w:before="0" w:after="160"/>
         <w:jc w:val="both"/>
       </w:pPr>
       <w:r>
@@ -2328,13 +2246,7 @@
         <w:rPr>
           <w:lang w:val="en-US"/>
         </w:rPr>
-        <w:t>The adaptive expectations rule is defined mathematically as</w:t>
-      </w:r>
-      <w:r>
-        <w:rPr>
-          <w:lang w:val="en-US"/>
-        </w:rPr>
-        <w:t>:</w:t>
+        <w:t>The adaptive expectations rule is defined mathematically as:</w:t>
       </w:r>
     </w:p>
     <w:p>
@@ -2641,13 +2553,7 @@
           <w:lang w:val="en-US"/>
         </w:rPr>
         <w:lastRenderedPageBreak/>
-        <w:t>Rearranging this to solve for expected inflation gives a weighted average of past inflation and past expectations</w:t>
-      </w:r>
-      <w:r>
-        <w:rPr>
-          <w:lang w:val="en-US"/>
-        </w:rPr>
-        <w:t>:</w:t>
+        <w:t>Rearranging this to solve for expected inflation gives a weighted average of past inflation and past expectations:</w:t>
       </w:r>
     </w:p>
     <w:p>
@@ -2709,14 +2615,7 @@
               <w:rFonts w:ascii="Cambria Math" w:eastAsia="Times New Roman" w:hAnsi="Cambria Math" w:cs="Times New Roman"/>
               <w:lang w:eastAsia="es-ES"/>
             </w:rPr>
-            <m:t>=</m:t>
-          </m:r>
-          <m:r>
-            <w:rPr>
-              <w:rFonts w:ascii="Cambria Math" w:eastAsia="Times New Roman" w:hAnsi="Cambria Math" w:cs="Times New Roman"/>
-              <w:lang w:eastAsia="es-ES"/>
-            </w:rPr>
-            <m:t>θ</m:t>
+            <m:t>=θ</m:t>
           </m:r>
           <m:sSub>
             <m:sSubPr>
@@ -2776,14 +2675,7 @@
                   <w:rFonts w:ascii="Cambria Math" w:eastAsia="Times New Roman" w:hAnsi="Cambria Math" w:cs="Times New Roman"/>
                   <w:lang w:eastAsia="es-ES"/>
                 </w:rPr>
-                <m:t>1-</m:t>
-              </m:r>
-              <m:r>
-                <w:rPr>
-                  <w:rFonts w:ascii="Cambria Math" w:eastAsia="Times New Roman" w:hAnsi="Cambria Math" w:cs="Times New Roman"/>
-                  <w:lang w:eastAsia="es-ES"/>
-                </w:rPr>
-                <m:t>θ</m:t>
+                <m:t>1-θ</m:t>
               </m:r>
             </m:e>
           </m:d>
@@ -3081,13 +2973,7 @@
         <w:rPr>
           <w:lang w:val="en-US"/>
         </w:rPr>
-        <w:t>Substitute this assumption into the Expectations-Augmented Phillips Curve (assuming</w:t>
-      </w:r>
-      <w:r>
-        <w:rPr>
-          <w:lang w:val="en-US"/>
-        </w:rPr>
-        <w:t xml:space="preserve"> </w:t>
+        <w:t xml:space="preserve">Substitute this assumption into the Expectations-Augmented Phillips Curve (assuming </w:t>
       </w:r>
       <m:oMath>
         <m:sSub>
@@ -3221,14 +3107,7 @@
               <w:rFonts w:ascii="Cambria Math" w:eastAsia="Times New Roman" w:hAnsi="Cambria Math" w:cs="Times New Roman"/>
               <w:lang w:eastAsia="es-ES"/>
             </w:rPr>
-            <m:t>-</m:t>
-          </m:r>
-          <m:r>
-            <w:rPr>
-              <w:rFonts w:ascii="Cambria Math" w:eastAsia="Times New Roman" w:hAnsi="Cambria Math" w:cs="Times New Roman"/>
-              <w:lang w:eastAsia="es-ES"/>
-            </w:rPr>
-            <m:t>β</m:t>
+            <m:t>-β</m:t>
           </m:r>
           <m:d>
             <m:dPr>
@@ -3395,13 +3274,7 @@
         <w:rPr>
           <w:lang w:val="en-US"/>
         </w:rPr>
-        <w:t xml:space="preserve"> in inflation</w:t>
-      </w:r>
-      <w:r>
-        <w:rPr>
-          <w:lang w:val="en-US"/>
-        </w:rPr>
-        <w:t>:</w:t>
+        <w:t xml:space="preserve"> in inflation:</w:t>
       </w:r>
     </w:p>
     <w:p>
@@ -3490,14 +3363,7 @@
               <w:rFonts w:ascii="Cambria Math" w:eastAsia="Times New Roman" w:hAnsi="Cambria Math" w:cs="Times New Roman"/>
               <w:lang w:eastAsia="es-ES"/>
             </w:rPr>
-            <m:t>=-</m:t>
-          </m:r>
-          <m:r>
-            <w:rPr>
-              <w:rFonts w:ascii="Cambria Math" w:eastAsia="Times New Roman" w:hAnsi="Cambria Math" w:cs="Times New Roman"/>
-              <w:lang w:eastAsia="es-ES"/>
-            </w:rPr>
-            <m:t>β</m:t>
+            <m:t>=-β</m:t>
           </m:r>
           <m:d>
             <m:dPr>
@@ -3610,13 +3476,7 @@
         <w:rPr>
           <w:lang w:val="en-US"/>
         </w:rPr>
-        <w:t>In this formulation, the "natural rate"</w:t>
-      </w:r>
-      <w:r>
-        <w:rPr>
-          <w:lang w:val="en-US"/>
-        </w:rPr>
-        <w:t xml:space="preserve"> </w:t>
+        <w:t xml:space="preserve">In this formulation, the "natural rate" </w:t>
       </w:r>
       <m:oMath>
         <m:sSup>
@@ -3755,14 +3615,7 @@
               <w:rFonts w:ascii="Cambria Math" w:eastAsia="Times New Roman" w:hAnsi="Cambria Math" w:cs="Times New Roman"/>
               <w:lang w:eastAsia="es-ES"/>
             </w:rPr>
-            <m:t>=-</m:t>
-          </m:r>
-          <m:r>
-            <w:rPr>
-              <w:rFonts w:ascii="Cambria Math" w:eastAsia="Times New Roman" w:hAnsi="Cambria Math" w:cs="Times New Roman"/>
-              <w:lang w:eastAsia="es-ES"/>
-            </w:rPr>
-            <m:t>β</m:t>
+            <m:t>=-β</m:t>
           </m:r>
           <m:d>
             <m:dPr>
@@ -3856,13 +3709,7 @@
         <w:rPr>
           <w:lang w:val="en-US"/>
         </w:rPr>
-        <w:t>If unemployment falls below the NAIRU</w:t>
-      </w:r>
-      <w:r>
-        <w:rPr>
-          <w:lang w:val="en-US"/>
-        </w:rPr>
-        <w:t xml:space="preserve"> </w:t>
+        <w:t xml:space="preserve">If unemployment falls below the NAIRU </w:t>
       </w:r>
       <m:oMath>
         <m:d>
@@ -4020,19 +3867,7 @@
         <w:rPr>
           <w:lang w:val="en-US"/>
         </w:rPr>
-        <w:t xml:space="preserve"> </w:t>
-      </w:r>
-      <w:r>
-        <w:rPr>
-          <w:lang w:val="en-US"/>
-        </w:rPr>
-        <w:t>To permanently maintain unemployment below</w:t>
-      </w:r>
-      <w:r>
-        <w:rPr>
-          <w:lang w:val="en-US"/>
-        </w:rPr>
-        <w:t xml:space="preserve"> </w:t>
+        <w:t xml:space="preserve"> To permanently maintain unemployment below </w:t>
       </w:r>
       <m:oMath>
         <m:sSup>
@@ -4073,19 +3908,17 @@
         <w:rPr>
           <w:lang w:val="en-US"/>
         </w:rPr>
-        <w:t>a central bank would have to generate infinite, ever-accelerating inflation, formally proving the long-run Phillips curve is vertical</w:t>
-      </w:r>
-      <w:r>
-        <w:rPr>
-          <w:lang w:val="en-US"/>
-        </w:rPr>
-        <w:t>.</w:t>
+        <w:t>a central bank would have to generate infinite, ever-accelerating inflation, formally proving the long-run Phillips curve is vertical.</w:t>
       </w:r>
     </w:p>
     <w:p>
       <w:pPr>
         <w:pStyle w:val="Ttulo4"/>
+        <w:spacing w:before="0" w:after="160"/>
         <w:jc w:val="both"/>
+        <w:rPr>
+          <w:lang w:val="en-US"/>
+        </w:rPr>
       </w:pPr>
       <w:r>
         <w:rPr>
@@ -4111,13 +3944,7 @@
         <w:rPr>
           <w:lang w:val="en-US"/>
         </w:rPr>
-        <w:t>R. Lucas (1976) and T. Sargent pointed out that adaptive expectations are systematically flawed. If inflation is constantly accelerating, an adaptive rule</w:t>
-      </w:r>
-      <w:r>
-        <w:rPr>
-          <w:lang w:val="en-US"/>
-        </w:rPr>
-        <w:t xml:space="preserve"> </w:t>
+        <w:t xml:space="preserve">R. Lucas (1976) and T. Sargent pointed out that adaptive expectations are systematically flawed. If inflation is constantly accelerating, an adaptive rule </w:t>
       </w:r>
       <m:oMath>
         <m:d>
@@ -4224,13 +4051,7 @@
         <w:rPr>
           <w:lang w:val="en-US"/>
         </w:rPr>
-        <w:t>Agents form expectations using all available information</w:t>
-      </w:r>
-      <w:r>
-        <w:rPr>
-          <w:lang w:val="en-US"/>
-        </w:rPr>
-        <w:t xml:space="preserve"> </w:t>
+        <w:t xml:space="preserve">Agents form expectations using all available information </w:t>
       </w:r>
       <m:oMath>
         <m:d>
@@ -4289,13 +4110,7 @@
         <w:rPr>
           <w:lang w:val="en-US"/>
         </w:rPr>
-        <w:t>, including the central bank's policy rules and the true structural model of the economy</w:t>
-      </w:r>
-      <w:r>
-        <w:rPr>
-          <w:lang w:val="en-US"/>
-        </w:rPr>
-        <w:t>:</w:t>
+        <w:t>, including the central bank's policy rules and the true structural model of the economy:</w:t>
       </w:r>
     </w:p>
     <w:p>
@@ -4645,14 +4460,7 @@
           <w:rFonts w:eastAsiaTheme="minorEastAsia"/>
           <w:lang w:val="en-US" w:eastAsia="es-ES"/>
         </w:rPr>
-        <w:t xml:space="preserve"> </w:t>
-      </w:r>
-      <w:r>
-        <w:rPr>
-          <w:rFonts w:eastAsiaTheme="minorEastAsia"/>
-          <w:lang w:val="en-US" w:eastAsia="es-ES"/>
-        </w:rPr>
-        <w:t xml:space="preserve">cannot contain any predictable pattern. Actual inflation only deviates from expected inflation by a purely random, white-noise shock </w:t>
+        <w:t xml:space="preserve"> cannot contain any predictable pattern. Actual inflation only deviates from expected inflation by a purely random, white-noise shock </w:t>
       </w:r>
       <m:oMath>
         <m:sSub>
@@ -4875,13 +4683,7 @@
         <w:rPr>
           <w:lang w:val="en-US"/>
         </w:rPr>
-        <w:t>Substituting this directly into the Expectations-Augmented Phillips curve</w:t>
-      </w:r>
-      <w:r>
-        <w:rPr>
-          <w:lang w:val="en-US"/>
-        </w:rPr>
-        <w:t>:</w:t>
+        <w:t>Substituting this directly into the Expectations-Augmented Phillips curve:</w:t>
       </w:r>
     </w:p>
     <w:p>
@@ -4934,14 +4736,7 @@
               <w:rFonts w:ascii="Cambria Math" w:eastAsia="Times New Roman" w:hAnsi="Cambria Math" w:cs="Times New Roman"/>
               <w:lang w:eastAsia="es-ES"/>
             </w:rPr>
-            <m:t>=-</m:t>
-          </m:r>
-          <m:r>
-            <w:rPr>
-              <w:rFonts w:ascii="Cambria Math" w:eastAsia="Times New Roman" w:hAnsi="Cambria Math" w:cs="Times New Roman"/>
-              <w:lang w:eastAsia="es-ES"/>
-            </w:rPr>
-            <m:t>β</m:t>
+            <m:t>=-β</m:t>
           </m:r>
           <m:d>
             <m:dPr>
@@ -5042,13 +4837,7 @@
         <w:rPr>
           <w:lang w:val="en-US"/>
         </w:rPr>
-        <w:t>Solving for unemployment</w:t>
-      </w:r>
-      <w:r>
-        <w:rPr>
-          <w:lang w:val="en-US"/>
-        </w:rPr>
-        <w:t xml:space="preserve"> </w:t>
+        <w:t xml:space="preserve">Solving for unemployment </w:t>
       </w:r>
       <m:oMath>
         <m:d>
@@ -5298,13 +5087,7 @@
           <w:lang w:val="en-US"/>
         </w:rPr>
         <w:lastRenderedPageBreak/>
-        <w:t>systematic policy</w:t>
-      </w:r>
-      <w:r>
-        <w:rPr>
-          <w:lang w:val="en-US"/>
-        </w:rPr>
-        <w:t xml:space="preserve">, </w:t>
+        <w:t xml:space="preserve">systematic policy, </w:t>
       </w:r>
       <m:oMath>
         <m:sSubSup>
@@ -5353,13 +5136,7 @@
         <w:rPr>
           <w:lang w:val="en-US"/>
         </w:rPr>
-        <w:t>adjusts instantly. Unemployment only deviates from the natural rate due to completely random, unanticipated shocks</w:t>
-      </w:r>
-      <w:r>
-        <w:rPr>
-          <w:lang w:val="en-US"/>
-        </w:rPr>
-        <w:t xml:space="preserve"> </w:t>
+        <w:t xml:space="preserve">adjusts instantly. Unemployment only deviates from the natural rate due to completely random, unanticipated shocks </w:t>
       </w:r>
       <m:oMath>
         <m:d>
@@ -5416,7 +5193,11 @@
     <w:p>
       <w:pPr>
         <w:pStyle w:val="Ttulo4"/>
+        <w:spacing w:before="0" w:after="160"/>
         <w:jc w:val="both"/>
+        <w:rPr>
+          <w:lang w:val="en-US"/>
+        </w:rPr>
       </w:pPr>
       <w:r>
         <w:rPr>
@@ -5433,6 +5214,7 @@
           <w:numId w:val="2"/>
         </w:numPr>
         <w:ind w:left="714" w:hanging="357"/>
+        <w:contextualSpacing w:val="0"/>
         <w:jc w:val="both"/>
         <w:rPr>
           <w:lang w:val="en-US"/>
@@ -5541,6 +5323,7 @@
           <w:numId w:val="2"/>
         </w:numPr>
         <w:ind w:left="714" w:hanging="357"/>
+        <w:contextualSpacing w:val="0"/>
         <w:jc w:val="both"/>
         <w:rPr>
           <w:lang w:val="en-US"/>
@@ -5561,6 +5344,7 @@
           <w:numId w:val="2"/>
         </w:numPr>
         <w:ind w:left="714" w:hanging="357"/>
+        <w:contextualSpacing w:val="0"/>
         <w:jc w:val="both"/>
         <w:rPr>
           <w:lang w:val="en-US"/>
@@ -5581,6 +5365,7 @@
           <w:numId w:val="2"/>
         </w:numPr>
         <w:ind w:left="714" w:hanging="357"/>
+        <w:contextualSpacing w:val="0"/>
         <w:jc w:val="both"/>
         <w:rPr>
           <w:lang w:val="en-US"/>
@@ -5590,16 +5375,11 @@
         <w:rPr>
           <w:lang w:val="en-US"/>
         </w:rPr>
-        <w:t>This empirical reality gave rise to New Keynesian Macroeconomics, which accepts rational expectations but introduces micro-founded nominal frictions (like Calvo staggered pricing or menu costs) to mathematically explain why prices and expectations do not adjust perfectly and instantaneously</w:t>
-      </w:r>
-      <w:r>
-        <w:rPr>
-          <w:lang w:val="en-US"/>
-        </w:rPr>
-        <w:t>.</w:t>
+        <w:t>This empirical reality gave rise to New Keynesian Macroeconomics, which accepts rational expectations but introduces micro-founded nominal frictions (like Calvo staggered pricing or menu costs) to mathematically explain why prices and expectations do not adjust perfectly and instantaneously.</w:t>
       </w:r>
     </w:p>
     <w:sectPr>
+      <w:headerReference w:type="default" r:id="rId7"/>
       <w:pgSz w:w="11906" w:h="16838"/>
       <w:pgMar w:top="1134" w:right="1701" w:bottom="1134" w:left="1701" w:header="709" w:footer="709" w:gutter="0"/>
       <w:cols w:space="708"/>
@@ -5607,6 +5387,70 @@
     </w:sectPr>
   </w:body>
 </w:document>
+</file>
+
+<file path=word/endnotes.xml><?xml version="1.0" encoding="utf-8"?>
+<w:endnotes xmlns:wpc="http://schemas.microsoft.com/office/word/2010/wordprocessingCanvas" xmlns:cx="http://schemas.microsoft.com/office/drawing/2014/chartex" xmlns:cx1="http://schemas.microsoft.com/office/drawing/2015/9/8/chartex" xmlns:cx2="http://schemas.microsoft.com/office/drawing/2015/10/21/chartex" xmlns:cx3="http://schemas.microsoft.com/office/drawing/2016/5/9/chartex" xmlns:cx4="http://schemas.microsoft.com/office/drawing/2016/5/10/chartex" xmlns:cx5="http://schemas.microsoft.com/office/drawing/2016/5/11/chartex" xmlns:cx6="http://schemas.microsoft.com/office/drawing/2016/5/12/chartex" xmlns:cx7="http://schemas.microsoft.com/office/drawing/2016/5/13/chartex" xmlns:cx8="http://schemas.microsoft.com/office/drawing/2016/5/14/chartex" xmlns:mc="http://schemas.openxmlformats.org/markup-compatibility/2006" xmlns:aink="http://schemas.microsoft.com/office/drawing/2016/ink" xmlns:am3d="http://schemas.microsoft.com/office/drawing/2017/model3d" xmlns:o="urn:schemas-microsoft-com:office:office" xmlns:r="http://schemas.openxmlformats.org/officeDocument/2006/relationships" xmlns:m="http://schemas.openxmlformats.org/officeDocument/2006/math" xmlns:v="urn:schemas-microsoft-com:vml" xmlns:wp14="http://schemas.microsoft.com/office/word/2010/wordprocessingDrawing" xmlns:wp="http://schemas.openxmlformats.org/drawingml/2006/wordprocessingDrawing" xmlns:w10="urn:schemas-microsoft-com:office:word" xmlns:w="http://schemas.openxmlformats.org/wordprocessingml/2006/main" xmlns:w14="http://schemas.microsoft.com/office/word/2010/wordml" xmlns:w15="http://schemas.microsoft.com/office/word/2012/wordml" xmlns:w16cex="http://schemas.microsoft.com/office/word/2018/wordml/cex" xmlns:w16cid="http://schemas.microsoft.com/office/word/2016/wordml/cid" xmlns:w16="http://schemas.microsoft.com/office/word/2018/wordml" xmlns:w16sdtdh="http://schemas.microsoft.com/office/word/2020/wordml/sdtdatahash" xmlns:w16se="http://schemas.microsoft.com/office/word/2015/wordml/symex" xmlns:wpg="http://schemas.microsoft.com/office/word/2010/wordprocessingGroup" xmlns:wpi="http://schemas.microsoft.com/office/word/2010/wordprocessingInk" xmlns:wne="http://schemas.microsoft.com/office/word/2006/wordml" xmlns:wps="http://schemas.microsoft.com/office/word/2010/wordprocessingShape" mc:Ignorable="w14 w15 w16se w16cid w16 w16cex w16sdtdh wp14">
+  <w:endnote w:type="separator" w:id="-1">
+    <w:p>
+      <w:pPr>
+        <w:spacing w:after="0" w:line="240" w:lineRule="auto"/>
+      </w:pPr>
+      <w:r>
+        <w:separator/>
+      </w:r>
+    </w:p>
+  </w:endnote>
+  <w:endnote w:type="continuationSeparator" w:id="0">
+    <w:p>
+      <w:pPr>
+        <w:spacing w:after="0" w:line="240" w:lineRule="auto"/>
+      </w:pPr>
+      <w:r>
+        <w:continuationSeparator/>
+      </w:r>
+    </w:p>
+  </w:endnote>
+</w:endnotes>
+</file>
+
+<file path=word/footnotes.xml><?xml version="1.0" encoding="utf-8"?>
+<w:footnotes xmlns:wpc="http://schemas.microsoft.com/office/word/2010/wordprocessingCanvas" xmlns:cx="http://schemas.microsoft.com/office/drawing/2014/chartex" xmlns:cx1="http://schemas.microsoft.com/office/drawing/2015/9/8/chartex" xmlns:cx2="http://schemas.microsoft.com/office/drawing/2015/10/21/chartex" xmlns:cx3="http://schemas.microsoft.com/office/drawing/2016/5/9/chartex" xmlns:cx4="http://schemas.microsoft.com/office/drawing/2016/5/10/chartex" xmlns:cx5="http://schemas.microsoft.com/office/drawing/2016/5/11/chartex" xmlns:cx6="http://schemas.microsoft.com/office/drawing/2016/5/12/chartex" xmlns:cx7="http://schemas.microsoft.com/office/drawing/2016/5/13/chartex" xmlns:cx8="http://schemas.microsoft.com/office/drawing/2016/5/14/chartex" xmlns:mc="http://schemas.openxmlformats.org/markup-compatibility/2006" xmlns:aink="http://schemas.microsoft.com/office/drawing/2016/ink" xmlns:am3d="http://schemas.microsoft.com/office/drawing/2017/model3d" xmlns:o="urn:schemas-microsoft-com:office:office" xmlns:r="http://schemas.openxmlformats.org/officeDocument/2006/relationships" xmlns:m="http://schemas.openxmlformats.org/officeDocument/2006/math" xmlns:v="urn:schemas-microsoft-com:vml" xmlns:wp14="http://schemas.microsoft.com/office/word/2010/wordprocessingDrawing" xmlns:wp="http://schemas.openxmlformats.org/drawingml/2006/wordprocessingDrawing" xmlns:w10="urn:schemas-microsoft-com:office:word" xmlns:w="http://schemas.openxmlformats.org/wordprocessingml/2006/main" xmlns:w14="http://schemas.microsoft.com/office/word/2010/wordml" xmlns:w15="http://schemas.microsoft.com/office/word/2012/wordml" xmlns:w16cex="http://schemas.microsoft.com/office/word/2018/wordml/cex" xmlns:w16cid="http://schemas.microsoft.com/office/word/2016/wordml/cid" xmlns:w16="http://schemas.microsoft.com/office/word/2018/wordml" xmlns:w16sdtdh="http://schemas.microsoft.com/office/word/2020/wordml/sdtdatahash" xmlns:w16se="http://schemas.microsoft.com/office/word/2015/wordml/symex" xmlns:wpg="http://schemas.microsoft.com/office/word/2010/wordprocessingGroup" xmlns:wpi="http://schemas.microsoft.com/office/word/2010/wordprocessingInk" xmlns:wne="http://schemas.microsoft.com/office/word/2006/wordml" xmlns:wps="http://schemas.microsoft.com/office/word/2010/wordprocessingShape" mc:Ignorable="w14 w15 w16se w16cid w16 w16cex w16sdtdh wp14">
+  <w:footnote w:type="separator" w:id="-1">
+    <w:p>
+      <w:pPr>
+        <w:spacing w:after="0" w:line="240" w:lineRule="auto"/>
+      </w:pPr>
+      <w:r>
+        <w:separator/>
+      </w:r>
+    </w:p>
+  </w:footnote>
+  <w:footnote w:type="continuationSeparator" w:id="0">
+    <w:p>
+      <w:pPr>
+        <w:spacing w:after="0" w:line="240" w:lineRule="auto"/>
+      </w:pPr>
+      <w:r>
+        <w:continuationSeparator/>
+      </w:r>
+    </w:p>
+  </w:footnote>
+</w:footnotes>
+</file>
+
+<file path=word/header1.xml><?xml version="1.0" encoding="utf-8"?>
+<w:hdr xmlns:wpc="http://schemas.microsoft.com/office/word/2010/wordprocessingCanvas" xmlns:cx="http://schemas.microsoft.com/office/drawing/2014/chartex" xmlns:cx1="http://schemas.microsoft.com/office/drawing/2015/9/8/chartex" xmlns:cx2="http://schemas.microsoft.com/office/drawing/2015/10/21/chartex" xmlns:cx3="http://schemas.microsoft.com/office/drawing/2016/5/9/chartex" xmlns:cx4="http://schemas.microsoft.com/office/drawing/2016/5/10/chartex" xmlns:cx5="http://schemas.microsoft.com/office/drawing/2016/5/11/chartex" xmlns:cx6="http://schemas.microsoft.com/office/drawing/2016/5/12/chartex" xmlns:cx7="http://schemas.microsoft.com/office/drawing/2016/5/13/chartex" xmlns:cx8="http://schemas.microsoft.com/office/drawing/2016/5/14/chartex" xmlns:mc="http://schemas.openxmlformats.org/markup-compatibility/2006" xmlns:aink="http://schemas.microsoft.com/office/drawing/2016/ink" xmlns:am3d="http://schemas.microsoft.com/office/drawing/2017/model3d" xmlns:o="urn:schemas-microsoft-com:office:office" xmlns:r="http://schemas.openxmlformats.org/officeDocument/2006/relationships" xmlns:m="http://schemas.openxmlformats.org/officeDocument/2006/math" xmlns:v="urn:schemas-microsoft-com:vml" xmlns:wp14="http://schemas.microsoft.com/office/word/2010/wordprocessingDrawing" xmlns:wp="http://schemas.openxmlformats.org/drawingml/2006/wordprocessingDrawing" xmlns:w10="urn:schemas-microsoft-com:office:word" xmlns:w="http://schemas.openxmlformats.org/wordprocessingml/2006/main" xmlns:w14="http://schemas.microsoft.com/office/word/2010/wordml" xmlns:w15="http://schemas.microsoft.com/office/word/2012/wordml" xmlns:w16cex="http://schemas.microsoft.com/office/word/2018/wordml/cex" xmlns:w16cid="http://schemas.microsoft.com/office/word/2016/wordml/cid" xmlns:w16="http://schemas.microsoft.com/office/word/2018/wordml" xmlns:w16sdtdh="http://schemas.microsoft.com/office/word/2020/wordml/sdtdatahash" xmlns:w16se="http://schemas.microsoft.com/office/word/2015/wordml/symex" xmlns:wpg="http://schemas.microsoft.com/office/word/2010/wordprocessingGroup" xmlns:wpi="http://schemas.microsoft.com/office/word/2010/wordprocessingInk" xmlns:wne="http://schemas.microsoft.com/office/word/2006/wordml" xmlns:wps="http://schemas.microsoft.com/office/word/2010/wordprocessingShape" mc:Ignorable="w14 w15 w16se w16cid w16 w16cex w16sdtdh wp14">
+  <w:p>
+    <w:pPr>
+      <w:pStyle w:val="Encabezado"/>
+      <w:jc w:val="right"/>
+    </w:pPr>
+    <w:r>
+      <w:t>JFCL</w:t>
+    </w:r>
+  </w:p>
+</w:hdr>
 </file>
 
 <file path=word/numbering.xml><?xml version="1.0" encoding="utf-8"?>
@@ -6891,6 +6735,50 @@
     <w:basedOn w:val="Fuentedeprrafopredeter"/>
     <w:rsid w:val="0090032A"/>
   </w:style>
+  <w:style w:type="paragraph" w:styleId="Encabezado">
+    <w:name w:val="header"/>
+    <w:basedOn w:val="Normal"/>
+    <w:link w:val="EncabezadoCar"/>
+    <w:uiPriority w:val="99"/>
+    <w:unhideWhenUsed/>
+    <w:rsid w:val="00423318"/>
+    <w:pPr>
+      <w:tabs>
+        <w:tab w:val="center" w:pos="4252"/>
+        <w:tab w:val="right" w:pos="8504"/>
+      </w:tabs>
+      <w:spacing w:after="0" w:line="240" w:lineRule="auto"/>
+    </w:pPr>
+  </w:style>
+  <w:style w:type="character" w:customStyle="1" w:styleId="EncabezadoCar">
+    <w:name w:val="Encabezado Car"/>
+    <w:basedOn w:val="Fuentedeprrafopredeter"/>
+    <w:link w:val="Encabezado"/>
+    <w:uiPriority w:val="99"/>
+    <w:rsid w:val="00423318"/>
+  </w:style>
+  <w:style w:type="paragraph" w:styleId="Piedepgina">
+    <w:name w:val="footer"/>
+    <w:basedOn w:val="Normal"/>
+    <w:link w:val="PiedepginaCar"/>
+    <w:uiPriority w:val="99"/>
+    <w:unhideWhenUsed/>
+    <w:rsid w:val="00423318"/>
+    <w:pPr>
+      <w:tabs>
+        <w:tab w:val="center" w:pos="4252"/>
+        <w:tab w:val="right" w:pos="8504"/>
+      </w:tabs>
+      <w:spacing w:after="0" w:line="240" w:lineRule="auto"/>
+    </w:pPr>
+  </w:style>
+  <w:style w:type="character" w:customStyle="1" w:styleId="PiedepginaCar">
+    <w:name w:val="Pie de página Car"/>
+    <w:basedOn w:val="Fuentedeprrafopredeter"/>
+    <w:link w:val="Piedepgina"/>
+    <w:uiPriority w:val="99"/>
+    <w:rsid w:val="00423318"/>
+  </w:style>
 </w:styles>
 </file>
 

</xml_diff>